<commit_message>
Fix contact email: contact@projethalima.org
Co-Authored-By: Claude Fable 5 <noreply@anthropic.com>
</commit_message>
<xml_diff>
--- a/docs/Annexe-Programmes-anglais-USA-UK.docx
+++ b/docs/Annexe-Programmes-anglais-USA-UK.docx
@@ -617,7 +617,7 @@
         </w:rPr>
         <w:t xml:space="preserve">Montants exacts non publiés pour le Niger (programmes comparables dans la région : 5 000 à 50 000 USD) — à confirmer en demandant le modèle de proposition à </w:t>
       </w:r>
-      <w:hyperlink w:history="1" r:id="rId925wev986mbseonwhyyyb">
+      <w:hyperlink w:history="1" r:id="rIdfqxi3chwnnon4vzwuzop1">
         <w:r>
           <w:rPr>
             <w:rStyle w:val="Hyperlink"/>
@@ -653,7 +653,7 @@
         </w:rPr>
         <w:t xml:space="preserve">Source : </w:t>
       </w:r>
-      <w:hyperlink w:history="1" r:id="rIdpuiakyehcit6jdh57uvst">
+      <w:hyperlink w:history="1" r:id="rId3omtge61dcr4vypjgrhs3">
         <w:r>
           <w:rPr>
             <w:rStyle w:val="Hyperlink"/>
@@ -702,7 +702,7 @@
         </w:rPr>
         <w:t xml:space="preserve">Source : </w:t>
       </w:r>
-      <w:hyperlink w:history="1" r:id="rIdawpyqdlxnlzi6yhkuiswq">
+      <w:hyperlink w:history="1" r:id="rIdv08hs0ynzyztr6z0dsddd">
         <w:r>
           <w:rPr>
             <w:rStyle w:val="Hyperlink"/>
@@ -751,7 +751,7 @@
         </w:rPr>
         <w:t xml:space="preserve">Source : </w:t>
       </w:r>
-      <w:hyperlink w:history="1" r:id="rId3mmeb_grgz8haf91ykib9">
+      <w:hyperlink w:history="1" r:id="rIdnnzn6mma48m-touwgn6dv">
         <w:r>
           <w:rPr>
             <w:rStyle w:val="Hyperlink"/>
@@ -797,7 +797,7 @@
         </w:rPr>
         <w:t xml:space="preserve"> — cours en ligne gratuits (8 semaines) pour enseignants d’anglais étrangers, financés par le Département d’État : </w:t>
       </w:r>
-      <w:hyperlink w:history="1" r:id="rIdadjosvwb-h5abfi2mptdf">
+      <w:hyperlink w:history="1" r:id="rId7mdgofki0m-jhu7f3brwx">
         <w:r>
           <w:rPr>
             <w:rStyle w:val="Hyperlink"/>
@@ -835,7 +835,7 @@
         </w:rPr>
         <w:t xml:space="preserve"> — matériels pédagogiques gratuits (jeux, livres, supports) : </w:t>
       </w:r>
-      <w:hyperlink w:history="1" r:id="rIdpqul3eqhwrraobnfkd_8d">
+      <w:hyperlink w:history="1" r:id="rIdkk-jsrz6rd92vybw9ymaf">
         <w:r>
           <w:rPr>
             <w:rStyle w:val="Hyperlink"/>
@@ -873,7 +873,7 @@
         </w:rPr>
         <w:t xml:space="preserve"> — conseil gratuit pour étudier aux É.-U., basé à l’American Corner de Niamey ; co-organisation d’événements envisageable : </w:t>
       </w:r>
-      <w:hyperlink w:history="1" r:id="rId4n10-tpkpg0juemycks1h">
+      <w:hyperlink w:history="1" r:id="rId2vfo6jxoxpul7ixakbdiv">
         <w:r>
           <w:rPr>
             <w:rStyle w:val="Hyperlink"/>
@@ -911,7 +911,7 @@
         </w:rPr>
         <w:t xml:space="preserve"> — SUSI (enseignants du secondaire), Fulbright (étudiants/chercheurs nigériens, cycle 2027-2028 ouvert), Mandela Washington Fellowship (leaders de 25-35 ans) : opportunités personnelles pour les membres et enseignants partenaires. Contact : </w:t>
       </w:r>
-      <w:hyperlink w:history="1" r:id="rId9tg3po3wyxvggjriut4e8">
+      <w:hyperlink w:history="1" r:id="rIdyzwxge4kmgu9nadeg4j0p">
         <w:r>
           <w:rPr>
             <w:rStyle w:val="Hyperlink"/>
@@ -989,7 +989,7 @@
         </w:rPr>
         <w:t xml:space="preserve">Sources : </w:t>
       </w:r>
-      <w:hyperlink w:history="1" r:id="rIdrzzgtzub4nujy1okkfd85">
+      <w:hyperlink w:history="1" r:id="rIdj-qdwt8s2tftfr1d0gekp">
         <w:r>
           <w:rPr>
             <w:rStyle w:val="Hyperlink"/>
@@ -1007,7 +1007,7 @@
         </w:rPr>
         <w:t xml:space="preserve">  ·  ressources gratuites : </w:t>
       </w:r>
-      <w:hyperlink w:history="1" r:id="rIdii2p1wtqvpuuk4lh5jwhz">
+      <w:hyperlink w:history="1" r:id="rId33seynyjk5emmhil0lmjs">
         <w:r>
           <w:rPr>
             <w:rStyle w:val="Hyperlink"/>
@@ -1056,7 +1056,7 @@
         </w:rPr>
         <w:t xml:space="preserve">Sources : </w:t>
       </w:r>
-      <w:hyperlink w:history="1" r:id="rIdymmydsj2ouwgst_r381yj">
+      <w:hyperlink w:history="1" r:id="rIdgls-icryt4duc8vsx_n8h">
         <w:r>
           <w:rPr>
             <w:rStyle w:val="Hyperlink"/>
@@ -1074,7 +1074,7 @@
         </w:rPr>
         <w:t xml:space="preserve">  ·  </w:t>
       </w:r>
-      <w:hyperlink w:history="1" r:id="rIdjmwjsirtljtgszd7os1jb">
+      <w:hyperlink w:history="1" r:id="rIdcy_muia98doenrgd8fp58">
         <w:r>
           <w:rPr>
             <w:rStyle w:val="Hyperlink"/>
@@ -1123,7 +1123,7 @@
         </w:rPr>
         <w:t xml:space="preserve">Source : </w:t>
       </w:r>
-      <w:hyperlink w:history="1" r:id="rId8kfeku9-mu3oy57k62jzt">
+      <w:hyperlink w:history="1" r:id="rIducdxbuev4se7ojgv-hwmd">
         <w:r>
           <w:rPr>
             <w:rStyle w:val="Hyperlink"/>
@@ -1407,14 +1407,14 @@
         </w:rPr>
         <w:t xml:space="preserve">Courriel : </w:t>
       </w:r>
-      <w:hyperlink w:history="1" r:id="rIduehydrvy8ix0bxu2omv5z">
+      <w:hyperlink w:history="1" r:id="rId4cv4fiovtvfassudbe5sm">
         <w:r>
           <w:rPr>
             <w:rStyle w:val="Hyperlink"/>
             <w:sz w:val="22"/>
             <w:szCs w:val="22"/>
           </w:rPr>
-          <w:t xml:space="preserve">contact@projethalima.com</w:t>
+          <w:t xml:space="preserve">contact@projethalima.org</w:t>
         </w:r>
       </w:hyperlink>
       <w:r>
@@ -1425,7 +1425,7 @@
         </w:rPr>
         <w:t xml:space="preserve">   ·   Site : </w:t>
       </w:r>
-      <w:hyperlink w:history="1" r:id="rIdbv65bvdus3p2n5t3otfan">
+      <w:hyperlink w:history="1" r:id="rIdujtxxuwinmh7pjyqgl6v8">
         <w:r>
           <w:rPr>
             <w:rStyle w:val="Hyperlink"/>
@@ -1506,7 +1506,7 @@
         <w:sz w:val="16"/>
         <w:szCs w:val="16"/>
       </w:rPr>
-      <w:t xml:space="preserve">Projet Halima · contact@projethalima.com · projethalima.web.app</w:t>
+      <w:t xml:space="preserve">Projet Halima · contact@projethalima.org · projethalima.web.app</w:t>
     </w:r>
     <w:r>
       <w:rPr>

</xml_diff>

<commit_message>
Rename to Projet Halima Seyni across site, docs, and SEO
- Wordmark, hero (with text-wrap balance), book cover, footer, README
- Mission reframed: carries both parents' names (Halima + Seyni,
  bookseller in Maradi); title now 'One Family, Two Missions'
- JSON-LD name + alternateName 'Projet Halima' for continuity
- All five French documents regenerated with the new name

Co-Authored-By: Claude Fable 5 <noreply@anthropic.com>
</commit_message>
<xml_diff>
--- a/docs/Annexe-Programmes-anglais-USA-UK.docx
+++ b/docs/Annexe-Programmes-anglais-USA-UK.docx
@@ -617,7 +617,7 @@
         </w:rPr>
         <w:t xml:space="preserve">Montants exacts non publiés pour le Niger (programmes comparables dans la région : 5 000 à 50 000 USD) — à confirmer en demandant le modèle de proposition à </w:t>
       </w:r>
-      <w:hyperlink w:history="1" r:id="rIdfqxi3chwnnon4vzwuzop1">
+      <w:hyperlink w:history="1" r:id="rIdcor5gn_d6-zrzguhyeo6f">
         <w:r>
           <w:rPr>
             <w:rStyle w:val="Hyperlink"/>
@@ -653,7 +653,7 @@
         </w:rPr>
         <w:t xml:space="preserve">Source : </w:t>
       </w:r>
-      <w:hyperlink w:history="1" r:id="rId3omtge61dcr4vypjgrhs3">
+      <w:hyperlink w:history="1" r:id="rId04vgnh9tpkfpjeebqmgha">
         <w:r>
           <w:rPr>
             <w:rStyle w:val="Hyperlink"/>
@@ -702,7 +702,7 @@
         </w:rPr>
         <w:t xml:space="preserve">Source : </w:t>
       </w:r>
-      <w:hyperlink w:history="1" r:id="rIdv08hs0ynzyztr6z0dsddd">
+      <w:hyperlink w:history="1" r:id="rIdbnvlg_md_due84rpzo7xq">
         <w:r>
           <w:rPr>
             <w:rStyle w:val="Hyperlink"/>
@@ -751,7 +751,7 @@
         </w:rPr>
         <w:t xml:space="preserve">Source : </w:t>
       </w:r>
-      <w:hyperlink w:history="1" r:id="rIdnnzn6mma48m-touwgn6dv">
+      <w:hyperlink w:history="1" r:id="rIdn_mdbmvpqgsrcsany1iuf">
         <w:r>
           <w:rPr>
             <w:rStyle w:val="Hyperlink"/>
@@ -797,7 +797,7 @@
         </w:rPr>
         <w:t xml:space="preserve"> — cours en ligne gratuits (8 semaines) pour enseignants d’anglais étrangers, financés par le Département d’État : </w:t>
       </w:r>
-      <w:hyperlink w:history="1" r:id="rId7mdgofki0m-jhu7f3brwx">
+      <w:hyperlink w:history="1" r:id="rId0hwalnigvd8ymhwfva8du">
         <w:r>
           <w:rPr>
             <w:rStyle w:val="Hyperlink"/>
@@ -835,7 +835,7 @@
         </w:rPr>
         <w:t xml:space="preserve"> — matériels pédagogiques gratuits (jeux, livres, supports) : </w:t>
       </w:r>
-      <w:hyperlink w:history="1" r:id="rIdkk-jsrz6rd92vybw9ymaf">
+      <w:hyperlink w:history="1" r:id="rIdu3izdud0ii_wtmy4dnphr">
         <w:r>
           <w:rPr>
             <w:rStyle w:val="Hyperlink"/>
@@ -873,7 +873,7 @@
         </w:rPr>
         <w:t xml:space="preserve"> — conseil gratuit pour étudier aux É.-U., basé à l’American Corner de Niamey ; co-organisation d’événements envisageable : </w:t>
       </w:r>
-      <w:hyperlink w:history="1" r:id="rId2vfo6jxoxpul7ixakbdiv">
+      <w:hyperlink w:history="1" r:id="rIdqwqptgutywff2rncj-1vl">
         <w:r>
           <w:rPr>
             <w:rStyle w:val="Hyperlink"/>
@@ -911,7 +911,7 @@
         </w:rPr>
         <w:t xml:space="preserve"> — SUSI (enseignants du secondaire), Fulbright (étudiants/chercheurs nigériens, cycle 2027-2028 ouvert), Mandela Washington Fellowship (leaders de 25-35 ans) : opportunités personnelles pour les membres et enseignants partenaires. Contact : </w:t>
       </w:r>
-      <w:hyperlink w:history="1" r:id="rIdyzwxge4kmgu9nadeg4j0p">
+      <w:hyperlink w:history="1" r:id="rIdzxxtxluwa3vv37b_b7glm">
         <w:r>
           <w:rPr>
             <w:rStyle w:val="Hyperlink"/>
@@ -989,7 +989,7 @@
         </w:rPr>
         <w:t xml:space="preserve">Sources : </w:t>
       </w:r>
-      <w:hyperlink w:history="1" r:id="rIdj-qdwt8s2tftfr1d0gekp">
+      <w:hyperlink w:history="1" r:id="rIddtoeo43xmi6uhdyirchbu">
         <w:r>
           <w:rPr>
             <w:rStyle w:val="Hyperlink"/>
@@ -1007,7 +1007,7 @@
         </w:rPr>
         <w:t xml:space="preserve">  ·  ressources gratuites : </w:t>
       </w:r>
-      <w:hyperlink w:history="1" r:id="rId33seynyjk5emmhil0lmjs">
+      <w:hyperlink w:history="1" r:id="rId3qoe9pibcibt089kqkwhf">
         <w:r>
           <w:rPr>
             <w:rStyle w:val="Hyperlink"/>
@@ -1036,7 +1036,7 @@
           <w:sz w:val="22"/>
           <w:szCs w:val="22"/>
         </w:rPr>
-        <w:t xml:space="preserve">Fondation britannique dédiée à l’enseignement de l’anglais dans les pays du Sud : bourses de Master TESOL au Royaume-Uni pour enseignants, et « Teacher Association Project Awards » (une quinzaine de petits projets financés par an, plus des aides d’environ 500 £ pour des événements). Particularité : ces financements passent par les associations d’enseignants d’anglais — or le Niger n’en a aucune répertoriée dans les annuaires TESOL/Africa ELTA à ce jour. Opportunité à moyen terme : fédérer les enseignants d’anglais partenaires de Projet Halima et contribuer à créer une association nationale (affiliée au réseau continental Africa ELTA), ce qui ouvrirait l’accès à ces fonds.</w:t>
+        <w:t xml:space="preserve">Fondation britannique dédiée à l’enseignement de l’anglais dans les pays du Sud : bourses de Master TESOL au Royaume-Uni pour enseignants, et « Teacher Association Project Awards » (une quinzaine de petits projets financés par an, plus des aides d’environ 500 £ pour des événements). Particularité : ces financements passent par les associations d’enseignants d’anglais — or le Niger n’en a aucune répertoriée dans les annuaires TESOL/Africa ELTA à ce jour. Opportunité à moyen terme : fédérer les enseignants d’anglais partenaires de Projet Halima Seyni et contribuer à créer une association nationale (affiliée au réseau continental Africa ELTA), ce qui ouvrirait l’accès à ces fonds.</w:t>
       </w:r>
     </w:p>
     <w:p>
@@ -1056,7 +1056,7 @@
         </w:rPr>
         <w:t xml:space="preserve">Sources : </w:t>
       </w:r>
-      <w:hyperlink w:history="1" r:id="rIdgls-icryt4duc8vsx_n8h">
+      <w:hyperlink w:history="1" r:id="rIdxcbgqittio3ojoprdwmgc">
         <w:r>
           <w:rPr>
             <w:rStyle w:val="Hyperlink"/>
@@ -1074,7 +1074,7 @@
         </w:rPr>
         <w:t xml:space="preserve">  ·  </w:t>
       </w:r>
-      <w:hyperlink w:history="1" r:id="rIdcy_muia98doenrgd8fp58">
+      <w:hyperlink w:history="1" r:id="rIdtj0njwdqm8roq5_lliaww">
         <w:r>
           <w:rPr>
             <w:rStyle w:val="Hyperlink"/>
@@ -1123,7 +1123,7 @@
         </w:rPr>
         <w:t xml:space="preserve">Source : </w:t>
       </w:r>
-      <w:hyperlink w:history="1" r:id="rIducdxbuev4se7ojgv-hwmd">
+      <w:hyperlink w:history="1" r:id="rId-dr84wrzvvkopcep9fi2s">
         <w:r>
           <w:rPr>
             <w:rStyle w:val="Hyperlink"/>
@@ -1407,7 +1407,7 @@
         </w:rPr>
         <w:t xml:space="preserve">Courriel : </w:t>
       </w:r>
-      <w:hyperlink w:history="1" r:id="rId4cv4fiovtvfassudbe5sm">
+      <w:hyperlink w:history="1" r:id="rIdjnepgx6k4viqhwmeo2wob">
         <w:r>
           <w:rPr>
             <w:rStyle w:val="Hyperlink"/>
@@ -1425,7 +1425,7 @@
         </w:rPr>
         <w:t xml:space="preserve">   ·   Site : </w:t>
       </w:r>
-      <w:hyperlink w:history="1" r:id="rIdujtxxuwinmh7pjyqgl6v8">
+      <w:hyperlink w:history="1" r:id="rIdlvdjzwcjzgxl7ivawqoab">
         <w:r>
           <w:rPr>
             <w:rStyle w:val="Hyperlink"/>
@@ -1506,7 +1506,7 @@
         <w:sz w:val="16"/>
         <w:szCs w:val="16"/>
       </w:rPr>
-      <w:t xml:space="preserve">Projet Halima · contact@projethalima.org · projethalima.web.app</w:t>
+      <w:t xml:space="preserve">Projet Halima Seyni · contact@projethalima.org · projethalima.web.app</w:t>
     </w:r>
     <w:r>
       <w:rPr>
@@ -1602,7 +1602,7 @@
         <w:sz w:val="18"/>
         <w:szCs w:val="18"/>
       </w:rPr>
-      <w:t xml:space="preserve">PROJET HALIMA</w:t>
+      <w:t xml:space="preserve">PROJET HALIMA SEYNI</w:t>
     </w:r>
     <w:r>
       <w:rPr>

</xml_diff>